<commit_message>
Add SignWell e-sign integration behind ESIGN_PROVIDER flag (per-page initials + end signature)
Migrates contract e-signing from DocuSign to SignWell behind a runtime ESIGN_PROVIDER flag (default docusign; set signwell to cut over). Verified live in test_mode: one initial on every page (via a repeating footer tag) plus a signature + auto-date at the end of the CPA, IDP, and BCA. The live DocuSign flow is unaffected until the flag is flipped.

New: lib/esign-config.ts (flag + field sizes), lib/signwell.ts (X-Api-Key client), app/api/signwell/webhook (HMAC) + migration 109, docs/integrations/signwell.md. Changed: contract-docx.ts shared helpers emit provider-specific tags (DocuSign path unchanged; also bundles the prior signature-anchor fix), esign-actions.ts send/void branch on the flag, proxy.ts allowlist.

Co-Authored-By: Claude Opus 4.8 (1M context) <noreply@anthropic.com>
</commit_message>
<xml_diff>
--- a/contract-samples/BCA - Brokerage Cooperation Agreement (SAMPLE).docx
+++ b/contract-samples/BCA - Brokerage Cooperation Agreement (SAMPLE).docx
@@ -170,7 +170,23 @@
           <w:sz w:val="24"/>
           <w:szCs w:val="24"/>
         </w:rPr>
-        <w:t xml:space="preserve"> (Ontario), with its principal office at 456 Example Avenue, Sault Ste. Marie, ON  P6A 1A1 (the "Brokerage");</w:t>
+        <w:t xml:space="preserve"> (Ontario), with its principal office at </w:t>
+      </w:r>
+      <w:r>
+        <w:rPr>
+          <w:rFonts w:ascii="Times New Roman" w:cs="Times New Roman" w:eastAsia="Times New Roman" w:hAnsi="Times New Roman"/>
+          <w:sz w:val="24"/>
+          <w:szCs w:val="24"/>
+        </w:rPr>
+        <w:t xml:space="preserve">456 Example Avenue, Sault Ste. Marie, ON  P6A 1A1</w:t>
+      </w:r>
+      <w:r>
+        <w:rPr>
+          <w:rFonts w:ascii="Times New Roman" w:cs="Times New Roman" w:eastAsia="Times New Roman" w:hAnsi="Times New Roman"/>
+          <w:sz w:val="24"/>
+          <w:szCs w:val="24"/>
+        </w:rPr>
+        <w:t xml:space="preserve"> (the "Brokerage");</w:t>
       </w:r>
     </w:p>
     <w:p>
@@ -390,7 +406,7 @@
           <w:sz w:val="24"/>
           <w:szCs w:val="24"/>
         </w:rPr>
-        <w:t xml:space="preserve">1.7 "Profit Share" means the profit-sharing fee payable by Firm Funds to the Brokerage in connection with each commission purchase transaction, in consideration of the Brokerage’s administrative cooperation under Article 2, calculated as a percentage of the sum of the Purchase Discount and the Settlement Period Fee (each as defined in the applicable CPA). The applicable Profit Share percentage for each Transaction shall be as set out in the applicable CPA, and may vary by Transaction.</w:t>
+        <w:t xml:space="preserve">1.7 "Profit Share" means the profit-sharing fee payable by Firm Funds to the Brokerage in connection with each commission purchase transaction, in consideration of the Brokerage's administrative cooperation under Article 2, calculated as a percentage of the sum of the Purchase Discount and the Settlement Period Fee (each as defined in the applicable CPA). The applicable Profit Share percentage for each Transaction shall be as set out in the applicable CPA, and may vary by Transaction.</w:t>
       </w:r>
     </w:p>
     <w:p>
@@ -523,7 +539,7 @@
           <w:sz w:val="24"/>
           <w:szCs w:val="24"/>
         </w:rPr>
-        <w:t xml:space="preserve">2.4 Administrative Cooperation. The Brokerage agrees to provide reasonable administrative assistance to facilitate the orderly processing of commission purchase transactions involving its Agents. Such assistance includes, without limitation: (a) submitting commission purchase requests to Firm Funds on behalf of its Agents, and assisting Agents in the preparation and submission of such requests through the Firm Funds portal; (b) confirming commission details on request, including the status of a Transaction, the gross commission, the applicable commission split, and the Expected Closing Date; (c) providing Firm Funds with supporting documentation reasonably required to process a Transaction, including a copy of the Agreement of Purchase and Sale and the trade record sheet; (d) holding the Commission in its real estate trust account and remitting the required amount to Firm Funds in accordance with each Irrevocable Direction to Pay and Article 4; and (e) providing payment confirmations in accordance with Article 4.3. For greater certainty, the Brokerage’s role is limited to the administrative cooperation described in this Agreement; the Brokerage does not underwrite, fund, or assume the credit risk of any Transaction, each of which remains the sole responsibility of Firm Funds. In consideration of this administrative cooperation, the Brokerage shall be entitled to the Profit Share set out in Article 4.</w:t>
+        <w:t xml:space="preserve">2.4 Administrative Cooperation. The Brokerage agrees to provide reasonable administrative assistance to facilitate the orderly processing of commission purchase transactions involving its Agents. Such assistance includes, without limitation: (a) submitting commission purchase requests to Firm Funds on behalf of its Agents, and assisting Agents in the preparation and submission of such requests through the Firm Funds portal; (b) confirming commission details on request, including the status of a Transaction, the gross commission, the applicable commission split, and the Expected Closing Date; (c) providing Firm Funds with supporting documentation reasonably required to process a Transaction, including a copy of the Agreement of Purchase and Sale and the trade record sheet; (d) holding the Commission in its real estate trust account and remitting the required amount to Firm Funds in accordance with each Irrevocable Direction to Pay and Article 4; and (e) providing payment confirmations in accordance with Article 4.3. For greater certainty, the Brokerage's role is limited to the administrative cooperation described in this Agreement; the Brokerage does not underwrite, fund, or assume the credit risk of any Transaction, each of which remains the sole responsibility of Firm Funds. In consideration of this administrative cooperation, the Brokerage shall be entitled to the Profit Share set out in Article 4.</w:t>
       </w:r>
     </w:p>
     <w:p>
@@ -1286,32 +1302,62 @@
     </w:p>
     <w:p>
       <w:pPr>
-        <w:spacing w:after="120"/>
-      </w:pPr>
-      <w:r>
-        <w:rPr>
-          <w:rFonts w:ascii="Times New Roman" w:cs="Times New Roman" w:eastAsia="Times New Roman" w:hAnsi="Times New Roman"/>
-          <w:i/>
-          <w:iCs/>
-          <w:sz w:val="24"/>
-          <w:szCs w:val="24"/>
-        </w:rPr>
-        <w:t xml:space="preserve">Signature: /sig1/</w:t>
-      </w:r>
-    </w:p>
-    <w:p>
-      <w:pPr>
-        <w:spacing w:after="120"/>
-      </w:pPr>
-      <w:r>
-        <w:rPr>
-          <w:rFonts w:ascii="Times New Roman" w:cs="Times New Roman" w:eastAsia="Times New Roman" w:hAnsi="Times New Roman"/>
-          <w:i/>
-          <w:iCs/>
-          <w:sz w:val="24"/>
-          <w:szCs w:val="24"/>
-        </w:rPr>
-        <w:t xml:space="preserve">Date Signed: /dat1/</w:t>
+        <w:spacing w:after="160"/>
+      </w:pPr>
+      <w:r>
+        <w:rPr>
+          <w:rFonts w:ascii="Times New Roman" w:cs="Times New Roman" w:eastAsia="Times New Roman" w:hAnsi="Times New Roman"/>
+          <w:sz w:val="24"/>
+          <w:szCs w:val="24"/>
+        </w:rPr>
+        <w:t xml:space="preserve">Signature: </w:t>
+      </w:r>
+      <w:r>
+        <w:rPr>
+          <w:rFonts w:ascii="Times New Roman" w:cs="Times New Roman" w:eastAsia="Times New Roman" w:hAnsi="Times New Roman"/>
+          <w:color w:val="FFFFFF"/>
+          <w:sz w:val="2"/>
+          <w:szCs w:val="2"/>
+        </w:rPr>
+        <w:t xml:space="preserve">/sig1/</w:t>
+      </w:r>
+      <w:r>
+        <w:rPr>
+          <w:rFonts w:ascii="Times New Roman" w:cs="Times New Roman" w:eastAsia="Times New Roman" w:hAnsi="Times New Roman"/>
+          <w:sz w:val="24"/>
+          <w:szCs w:val="24"/>
+        </w:rPr>
+        <w:t xml:space="preserve">_______________________________</w:t>
+      </w:r>
+    </w:p>
+    <w:p>
+      <w:pPr>
+        <w:spacing w:after="160"/>
+      </w:pPr>
+      <w:r>
+        <w:rPr>
+          <w:rFonts w:ascii="Times New Roman" w:cs="Times New Roman" w:eastAsia="Times New Roman" w:hAnsi="Times New Roman"/>
+          <w:sz w:val="24"/>
+          <w:szCs w:val="24"/>
+        </w:rPr>
+        <w:t xml:space="preserve">Date Signed: </w:t>
+      </w:r>
+      <w:r>
+        <w:rPr>
+          <w:rFonts w:ascii="Times New Roman" w:cs="Times New Roman" w:eastAsia="Times New Roman" w:hAnsi="Times New Roman"/>
+          <w:color w:val="FFFFFF"/>
+          <w:sz w:val="2"/>
+          <w:szCs w:val="2"/>
+        </w:rPr>
+        <w:t xml:space="preserve">/dat1/</w:t>
+      </w:r>
+      <w:r>
+        <w:rPr>
+          <w:rFonts w:ascii="Times New Roman" w:cs="Times New Roman" w:eastAsia="Times New Roman" w:hAnsi="Times New Roman"/>
+          <w:sz w:val="24"/>
+          <w:szCs w:val="24"/>
+        </w:rPr>
+        <w:t xml:space="preserve">_______________________________</w:t>
       </w:r>
     </w:p>
     <w:sectPr>

</xml_diff>